<commit_message>
Update guide with relocated method comparison table
</commit_message>
<xml_diff>
--- a/doc/tiCrypt_FileTransfer_Guide.docx
+++ b/doc/tiCrypt_FileTransfer_Guide.docx
@@ -3188,6 +3188,907 @@
         </w:rPr>
         <w:t xml:space="preserve">Directory ownership after copying from Vault into a VM</w:t>
       </w:r>
+    </w:p>
+    <w:p>
+      <w:pPr>
+        <w:pBdr>
+          <w:bottom w:val="single" w:color="CCCCCC" w:sz="6" w:space="1"/>
+        </w:pBdr>
+        <w:spacing w:after="300"/>
+      </w:pPr>
+    </w:p>
+    <w:p>
+      <w:pPr>
+        <w:pStyle w:val="Heading1"/>
+        <w:spacing w:after="160" w:before="360"/>
+      </w:pPr>
+      <w:r>
+        <w:t xml:space="preserve">Method Comparison</w:t>
+      </w:r>
+    </w:p>
+    <w:p>
+      <w:pPr>
+        <w:spacing w:after="160"/>
+      </w:pPr>
+      <w:r>
+        <w:t xml:space="preserve">Now that you've seen each method in detail, here's a closer look at how they work, when to reach for each, and their trade-offs:</w:t>
+      </w:r>
+    </w:p>
+    <w:tbl>
+      <w:tblPr>
+        <w:tblW w:type="dxa" w:w="9100"/>
+        <w:tblBorders>
+          <w:top w:val="single" w:color="auto" w:sz="4"/>
+          <w:left w:val="single" w:color="auto" w:sz="4"/>
+          <w:bottom w:val="single" w:color="auto" w:sz="4"/>
+          <w:right w:val="single" w:color="auto" w:sz="4"/>
+          <w:insideH w:val="single" w:color="auto" w:sz="4"/>
+          <w:insideV w:val="single" w:color="auto" w:sz="4"/>
+        </w:tblBorders>
+      </w:tblPr>
+      <w:tblGrid>
+        <w:gridCol w:w="1300"/>
+        <w:gridCol w:w="1950"/>
+        <w:gridCol w:w="1950"/>
+        <w:gridCol w:w="1950"/>
+        <w:gridCol w:w="1950"/>
+      </w:tblGrid>
+      <w:tr>
+        <w:tc>
+          <w:tcPr>
+            <w:tcW w:type="dxa" w:w="1300"/>
+            <w:shd w:fill="2E5E8C" w:val="clear"/>
+          </w:tcPr>
+          <w:p>
+            <w:pPr>
+              <w:spacing w:after="40"/>
+            </w:pPr>
+            <w:r>
+              <w:rPr>
+                <w:b/>
+                <w:bCs/>
+                <w:color w:val="FFFFFF"/>
+                <w:sz w:val="20"/>
+                <w:szCs w:val="20"/>
+              </w:rPr>
+              <w:t xml:space="preserve">Method</w:t>
+            </w:r>
+          </w:p>
+        </w:tc>
+        <w:tc>
+          <w:tcPr>
+            <w:tcW w:type="dxa" w:w="1950"/>
+            <w:shd w:fill="2E5E8C" w:val="clear"/>
+          </w:tcPr>
+          <w:p>
+            <w:pPr>
+              <w:spacing w:after="40"/>
+            </w:pPr>
+            <w:r>
+              <w:rPr>
+                <w:b/>
+                <w:bCs/>
+                <w:color w:val="FFFFFF"/>
+                <w:sz w:val="20"/>
+                <w:szCs w:val="20"/>
+              </w:rPr>
+              <w:t xml:space="preserve">How It Works</w:t>
+            </w:r>
+          </w:p>
+        </w:tc>
+        <w:tc>
+          <w:tcPr>
+            <w:tcW w:type="dxa" w:w="1950"/>
+            <w:shd w:fill="2E5E8C" w:val="clear"/>
+          </w:tcPr>
+          <w:p>
+            <w:pPr>
+              <w:spacing w:after="40"/>
+            </w:pPr>
+            <w:r>
+              <w:rPr>
+                <w:b/>
+                <w:bCs/>
+                <w:color w:val="FFFFFF"/>
+                <w:sz w:val="20"/>
+                <w:szCs w:val="20"/>
+              </w:rPr>
+              <w:t xml:space="preserve">When to Use</w:t>
+            </w:r>
+          </w:p>
+        </w:tc>
+        <w:tc>
+          <w:tcPr>
+            <w:tcW w:type="dxa" w:w="1950"/>
+            <w:shd w:fill="2E5E8C" w:val="clear"/>
+          </w:tcPr>
+          <w:p>
+            <w:pPr>
+              <w:spacing w:after="40"/>
+            </w:pPr>
+            <w:r>
+              <w:rPr>
+                <w:b/>
+                <w:bCs/>
+                <w:color w:val="FFFFFF"/>
+                <w:sz w:val="20"/>
+                <w:szCs w:val="20"/>
+              </w:rPr>
+              <w:t xml:space="preserve">Advantages</w:t>
+            </w:r>
+          </w:p>
+        </w:tc>
+        <w:tc>
+          <w:tcPr>
+            <w:tcW w:type="dxa" w:w="1950"/>
+            <w:shd w:fill="2E5E8C" w:val="clear"/>
+          </w:tcPr>
+          <w:p>
+            <w:pPr>
+              <w:spacing w:after="40"/>
+            </w:pPr>
+            <w:r>
+              <w:rPr>
+                <w:b/>
+                <w:bCs/>
+                <w:color w:val="FFFFFF"/>
+                <w:sz w:val="20"/>
+                <w:szCs w:val="20"/>
+              </w:rPr>
+              <w:t xml:space="preserve">Disadvantages</w:t>
+            </w:r>
+          </w:p>
+        </w:tc>
+      </w:tr>
+      <w:tr>
+        <w:tc>
+          <w:tcPr>
+            <w:tcW w:type="dxa" w:w="1300"/>
+          </w:tcPr>
+          <w:p>
+            <w:pPr>
+              <w:spacing w:after="40"/>
+            </w:pPr>
+            <w:r>
+              <w:rPr>
+                <w:b/>
+                <w:bCs/>
+                <w:color w:val="000000"/>
+                <w:sz w:val="17"/>
+                <w:szCs w:val="17"/>
+              </w:rPr>
+              <w:t xml:space="preserve">SFTP to VM</w:t>
+            </w:r>
+          </w:p>
+        </w:tc>
+        <w:tc>
+          <w:tcPr>
+            <w:tcW w:type="dxa" w:w="1950"/>
+          </w:tcPr>
+          <w:p>
+            <w:pPr>
+              <w:spacing w:after="40"/>
+            </w:pPr>
+            <w:r>
+              <w:rPr>
+                <w:b w:val="false"/>
+                <w:bCs w:val="false"/>
+                <w:color w:val="000000"/>
+                <w:sz w:val="17"/>
+                <w:szCs w:val="17"/>
+              </w:rPr>
+              <w:t xml:space="preserve">WinSCP connects directly to the VM over SFTP through the tiCrypt tunnel; you drag and drop files between two side-by-side panels.</w:t>
+            </w:r>
+          </w:p>
+        </w:tc>
+        <w:tc>
+          <w:tcPr>
+            <w:tcW w:type="dxa" w:w="1950"/>
+          </w:tcPr>
+          <w:p>
+            <w:pPr>
+              <w:spacing w:after="40"/>
+            </w:pPr>
+            <w:r>
+              <w:rPr>
+                <w:b w:val="false"/>
+                <w:bCs w:val="false"/>
+                <w:color w:val="000000"/>
+                <w:sz w:val="17"/>
+                <w:szCs w:val="17"/>
+              </w:rPr>
+              <w:t xml:space="preserve">One-time or occasional uploads; you just need to get a few files onto the VM without ongoing access.</w:t>
+            </w:r>
+          </w:p>
+        </w:tc>
+        <w:tc>
+          <w:tcPr>
+            <w:tcW w:type="dxa" w:w="1950"/>
+          </w:tcPr>
+          <w:p>
+            <w:pPr>
+              <w:pStyle w:val="ListParagraph"/>
+              <w:numPr>
+                <w:ilvl w:val="0"/>
+                <w:numId w:val="1"/>
+              </w:numPr>
+              <w:spacing w:after="20"/>
+              <w:ind w:left="130" w:hanging="130"/>
+            </w:pPr>
+            <w:r>
+              <w:rPr>
+                <w:color w:val="000000"/>
+                <w:sz w:val="17"/>
+                <w:szCs w:val="17"/>
+              </w:rPr>
+              <w:t xml:space="preserve">No install beyond WinSCP</w:t>
+            </w:r>
+          </w:p>
+          <w:p>
+            <w:pPr>
+              <w:pStyle w:val="ListParagraph"/>
+              <w:numPr>
+                <w:ilvl w:val="0"/>
+                <w:numId w:val="1"/>
+              </w:numPr>
+              <w:spacing w:after="20"/>
+              <w:ind w:left="130" w:hanging="130"/>
+            </w:pPr>
+            <w:r>
+              <w:rPr>
+                <w:color w:val="000000"/>
+                <w:sz w:val="17"/>
+                <w:szCs w:val="17"/>
+              </w:rPr>
+              <w:t xml:space="preserve">Simple, visual, low setup</w:t>
+            </w:r>
+          </w:p>
+          <w:p>
+            <w:pPr>
+              <w:pStyle w:val="ListParagraph"/>
+              <w:numPr>
+                <w:ilvl w:val="0"/>
+                <w:numId w:val="1"/>
+              </w:numPr>
+              <w:spacing w:after="20"/>
+              <w:ind w:left="130" w:hanging="130"/>
+            </w:pPr>
+            <w:r>
+              <w:rPr>
+                <w:color w:val="000000"/>
+                <w:sz w:val="17"/>
+                <w:szCs w:val="17"/>
+              </w:rPr>
+              <w:t xml:space="preserve">Credentials are ephemeral per session</w:t>
+            </w:r>
+          </w:p>
+        </w:tc>
+        <w:tc>
+          <w:tcPr>
+            <w:tcW w:type="dxa" w:w="1950"/>
+          </w:tcPr>
+          <w:p>
+            <w:pPr>
+              <w:pStyle w:val="ListParagraph"/>
+              <w:numPr>
+                <w:ilvl w:val="0"/>
+                <w:numId w:val="1"/>
+              </w:numPr>
+              <w:spacing w:after="20"/>
+              <w:ind w:left="130" w:hanging="130"/>
+            </w:pPr>
+            <w:r>
+              <w:rPr>
+                <w:color w:val="000000"/>
+                <w:sz w:val="17"/>
+                <w:szCs w:val="17"/>
+              </w:rPr>
+              <w:t xml:space="preserve">Write-only — can't download/browse existing VM files</w:t>
+            </w:r>
+          </w:p>
+          <w:p>
+            <w:pPr>
+              <w:pStyle w:val="ListParagraph"/>
+              <w:numPr>
+                <w:ilvl w:val="0"/>
+                <w:numId w:val="1"/>
+              </w:numPr>
+              <w:spacing w:after="20"/>
+              <w:ind w:left="130" w:hanging="130"/>
+            </w:pPr>
+            <w:r>
+              <w:rPr>
+                <w:color w:val="000000"/>
+                <w:sz w:val="17"/>
+                <w:szCs w:val="17"/>
+              </w:rPr>
+              <w:t xml:space="preserve">Manual reconnect needed each session</w:t>
+            </w:r>
+          </w:p>
+          <w:p>
+            <w:pPr>
+              <w:pStyle w:val="ListParagraph"/>
+              <w:numPr>
+                <w:ilvl w:val="0"/>
+                <w:numId w:val="1"/>
+              </w:numPr>
+              <w:spacing w:after="20"/>
+              <w:ind w:left="130" w:hanging="130"/>
+            </w:pPr>
+            <w:r>
+              <w:rPr>
+                <w:color w:val="000000"/>
+                <w:sz w:val="17"/>
+                <w:szCs w:val="17"/>
+              </w:rPr>
+              <w:t xml:space="preserve">Not suited to large batch transfers</w:t>
+            </w:r>
+          </w:p>
+        </w:tc>
+      </w:tr>
+      <w:tr>
+        <w:tc>
+          <w:tcPr>
+            <w:tcW w:type="dxa" w:w="1300"/>
+          </w:tcPr>
+          <w:p>
+            <w:pPr>
+              <w:spacing w:after="40"/>
+            </w:pPr>
+            <w:r>
+              <w:rPr>
+                <w:b/>
+                <w:bCs/>
+                <w:color w:val="000000"/>
+                <w:sz w:val="17"/>
+                <w:szCs w:val="17"/>
+              </w:rPr>
+              <w:t xml:space="preserve">SSHFS</w:t>
+            </w:r>
+          </w:p>
+        </w:tc>
+        <w:tc>
+          <w:tcPr>
+            <w:tcW w:type="dxa" w:w="1950"/>
+          </w:tcPr>
+          <w:p>
+            <w:pPr>
+              <w:spacing w:after="40"/>
+            </w:pPr>
+            <w:r>
+              <w:rPr>
+                <w:b w:val="false"/>
+                <w:bCs w:val="false"/>
+                <w:color w:val="000000"/>
+                <w:sz w:val="17"/>
+                <w:szCs w:val="17"/>
+              </w:rPr>
+              <w:t xml:space="preserve">SSHFS-Win + WinFsp mount the VM as a network drive letter in File Explorer, backed by the same SFTP tunnel.</w:t>
+            </w:r>
+          </w:p>
+        </w:tc>
+        <w:tc>
+          <w:tcPr>
+            <w:tcW w:type="dxa" w:w="1950"/>
+          </w:tcPr>
+          <w:p>
+            <w:pPr>
+              <w:spacing w:after="40"/>
+            </w:pPr>
+            <w:r>
+              <w:rPr>
+                <w:b w:val="false"/>
+                <w:bCs w:val="false"/>
+                <w:color w:val="000000"/>
+                <w:sz w:val="17"/>
+                <w:szCs w:val="17"/>
+              </w:rPr>
+              <w:t xml:space="preserve">Ongoing work sessions where you want to browse/edit VM files like a local folder over a period of time.</w:t>
+            </w:r>
+          </w:p>
+        </w:tc>
+        <w:tc>
+          <w:tcPr>
+            <w:tcW w:type="dxa" w:w="1950"/>
+          </w:tcPr>
+          <w:p>
+            <w:pPr>
+              <w:pStyle w:val="ListParagraph"/>
+              <w:numPr>
+                <w:ilvl w:val="0"/>
+                <w:numId w:val="1"/>
+              </w:numPr>
+              <w:spacing w:after="20"/>
+              <w:ind w:left="130" w:hanging="130"/>
+            </w:pPr>
+            <w:r>
+              <w:rPr>
+                <w:color w:val="000000"/>
+                <w:sz w:val="17"/>
+                <w:szCs w:val="17"/>
+              </w:rPr>
+              <w:t xml:space="preserve">Drag-and-drop from File Explorer</w:t>
+            </w:r>
+          </w:p>
+          <w:p>
+            <w:pPr>
+              <w:pStyle w:val="ListParagraph"/>
+              <w:numPr>
+                <w:ilvl w:val="0"/>
+                <w:numId w:val="1"/>
+              </w:numPr>
+              <w:spacing w:after="20"/>
+              <w:ind w:left="130" w:hanging="130"/>
+            </w:pPr>
+            <w:r>
+              <w:rPr>
+                <w:color w:val="000000"/>
+                <w:sz w:val="17"/>
+                <w:szCs w:val="17"/>
+              </w:rPr>
+              <w:t xml:space="preserve">Feels like a local/network drive</w:t>
+            </w:r>
+          </w:p>
+          <w:p>
+            <w:pPr>
+              <w:pStyle w:val="ListParagraph"/>
+              <w:numPr>
+                <w:ilvl w:val="0"/>
+                <w:numId w:val="1"/>
+              </w:numPr>
+              <w:spacing w:after="20"/>
+              <w:ind w:left="130" w:hanging="130"/>
+            </w:pPr>
+            <w:r>
+              <w:rPr>
+                <w:color w:val="000000"/>
+                <w:sz w:val="17"/>
+                <w:szCs w:val="17"/>
+              </w:rPr>
+              <w:t xml:space="preserve">No client app window to manage</w:t>
+            </w:r>
+          </w:p>
+        </w:tc>
+        <w:tc>
+          <w:tcPr>
+            <w:tcW w:type="dxa" w:w="1950"/>
+          </w:tcPr>
+          <w:p>
+            <w:pPr>
+              <w:pStyle w:val="ListParagraph"/>
+              <w:numPr>
+                <w:ilvl w:val="0"/>
+                <w:numId w:val="1"/>
+              </w:numPr>
+              <w:spacing w:after="20"/>
+              <w:ind w:left="130" w:hanging="130"/>
+            </w:pPr>
+            <w:r>
+              <w:rPr>
+                <w:color w:val="000000"/>
+                <w:sz w:val="17"/>
+                <w:szCs w:val="17"/>
+              </w:rPr>
+              <w:t xml:space="preserve">One-time driver install (WinFsp + SSHFS-Win)</w:t>
+            </w:r>
+          </w:p>
+          <w:p>
+            <w:pPr>
+              <w:pStyle w:val="ListParagraph"/>
+              <w:numPr>
+                <w:ilvl w:val="0"/>
+                <w:numId w:val="1"/>
+              </w:numPr>
+              <w:spacing w:after="20"/>
+              <w:ind w:left="130" w:hanging="130"/>
+            </w:pPr>
+            <w:r>
+              <w:rPr>
+                <w:color w:val="000000"/>
+                <w:sz w:val="17"/>
+                <w:szCs w:val="17"/>
+              </w:rPr>
+              <w:t xml:space="preserve">Mount breaks when the tiCrypt session/port expires</w:t>
+            </w:r>
+          </w:p>
+          <w:p>
+            <w:pPr>
+              <w:pStyle w:val="ListParagraph"/>
+              <w:numPr>
+                <w:ilvl w:val="0"/>
+                <w:numId w:val="1"/>
+              </w:numPr>
+              <w:spacing w:after="20"/>
+              <w:ind w:left="130" w:hanging="130"/>
+            </w:pPr>
+            <w:r>
+              <w:rPr>
+                <w:color w:val="000000"/>
+                <w:sz w:val="17"/>
+                <w:szCs w:val="17"/>
+              </w:rPr>
+              <w:t xml:space="preserve">Occasional stale credential prompts</w:t>
+            </w:r>
+          </w:p>
+        </w:tc>
+      </w:tr>
+      <w:tr>
+        <w:tc>
+          <w:tcPr>
+            <w:tcW w:type="dxa" w:w="1300"/>
+          </w:tcPr>
+          <w:p>
+            <w:pPr>
+              <w:spacing w:after="40"/>
+            </w:pPr>
+            <w:r>
+              <w:rPr>
+                <w:b/>
+                <w:bCs/>
+                <w:color w:val="000000"/>
+                <w:sz w:val="17"/>
+                <w:szCs w:val="17"/>
+              </w:rPr>
+              <w:t xml:space="preserve">lftp</w:t>
+            </w:r>
+          </w:p>
+        </w:tc>
+        <w:tc>
+          <w:tcPr>
+            <w:tcW w:type="dxa" w:w="1950"/>
+          </w:tcPr>
+          <w:p>
+            <w:pPr>
+              <w:spacing w:after="40"/>
+            </w:pPr>
+            <w:r>
+              <w:rPr>
+                <w:b w:val="false"/>
+                <w:bCs w:val="false"/>
+                <w:color w:val="000000"/>
+                <w:sz w:val="17"/>
+                <w:szCs w:val="17"/>
+              </w:rPr>
+              <w:t xml:space="preserve">A command-line SFTP client running inside WSL connects to the same tunnel; transfers and scripting happen via typed commands.</w:t>
+            </w:r>
+          </w:p>
+        </w:tc>
+        <w:tc>
+          <w:tcPr>
+            <w:tcW w:type="dxa" w:w="1950"/>
+          </w:tcPr>
+          <w:p>
+            <w:pPr>
+              <w:spacing w:after="40"/>
+            </w:pPr>
+            <w:r>
+              <w:rPr>
+                <w:b w:val="false"/>
+                <w:bCs w:val="false"/>
+                <w:color w:val="000000"/>
+                <w:sz w:val="17"/>
+                <w:szCs w:val="17"/>
+              </w:rPr>
+              <w:t xml:space="preserve">Bulk, repeated, or scripted transfers; resumable or parallel uploads; comfortable working in a terminal.</w:t>
+            </w:r>
+          </w:p>
+        </w:tc>
+        <w:tc>
+          <w:tcPr>
+            <w:tcW w:type="dxa" w:w="1950"/>
+          </w:tcPr>
+          <w:p>
+            <w:pPr>
+              <w:pStyle w:val="ListParagraph"/>
+              <w:numPr>
+                <w:ilvl w:val="0"/>
+                <w:numId w:val="1"/>
+              </w:numPr>
+              <w:spacing w:after="20"/>
+              <w:ind w:left="130" w:hanging="130"/>
+            </w:pPr>
+            <w:r>
+              <w:rPr>
+                <w:color w:val="000000"/>
+                <w:sz w:val="17"/>
+                <w:szCs w:val="17"/>
+              </w:rPr>
+              <w:t xml:space="preserve">Resumable and parallel (--parallel=N) transfers</w:t>
+            </w:r>
+          </w:p>
+          <w:p>
+            <w:pPr>
+              <w:pStyle w:val="ListParagraph"/>
+              <w:numPr>
+                <w:ilvl w:val="0"/>
+                <w:numId w:val="1"/>
+              </w:numPr>
+              <w:spacing w:after="20"/>
+              <w:ind w:left="130" w:hanging="130"/>
+            </w:pPr>
+            <w:r>
+              <w:rPr>
+                <w:color w:val="000000"/>
+                <w:sz w:val="17"/>
+                <w:szCs w:val="17"/>
+              </w:rPr>
+              <w:t xml:space="preserve">Scriptable/automatable</w:t>
+            </w:r>
+          </w:p>
+          <w:p>
+            <w:pPr>
+              <w:pStyle w:val="ListParagraph"/>
+              <w:numPr>
+                <w:ilvl w:val="0"/>
+                <w:numId w:val="1"/>
+              </w:numPr>
+              <w:spacing w:after="20"/>
+              <w:ind w:left="130" w:hanging="130"/>
+            </w:pPr>
+            <w:r>
+              <w:rPr>
+                <w:color w:val="000000"/>
+                <w:sz w:val="17"/>
+                <w:szCs w:val="17"/>
+              </w:rPr>
+              <w:t xml:space="preserve">Handles large batches well with mirror</w:t>
+            </w:r>
+          </w:p>
+        </w:tc>
+        <w:tc>
+          <w:tcPr>
+            <w:tcW w:type="dxa" w:w="1950"/>
+          </w:tcPr>
+          <w:p>
+            <w:pPr>
+              <w:pStyle w:val="ListParagraph"/>
+              <w:numPr>
+                <w:ilvl w:val="0"/>
+                <w:numId w:val="1"/>
+              </w:numPr>
+              <w:spacing w:after="20"/>
+              <w:ind w:left="130" w:hanging="130"/>
+            </w:pPr>
+            <w:r>
+              <w:rPr>
+                <w:color w:val="000000"/>
+                <w:sz w:val="17"/>
+                <w:szCs w:val="17"/>
+              </w:rPr>
+              <w:t xml:space="preserve">Requires WSL install (Windows-only limitation)</w:t>
+            </w:r>
+          </w:p>
+          <w:p>
+            <w:pPr>
+              <w:pStyle w:val="ListParagraph"/>
+              <w:numPr>
+                <w:ilvl w:val="0"/>
+                <w:numId w:val="1"/>
+              </w:numPr>
+              <w:spacing w:after="20"/>
+              <w:ind w:left="130" w:hanging="130"/>
+            </w:pPr>
+            <w:r>
+              <w:rPr>
+                <w:color w:val="000000"/>
+                <w:sz w:val="17"/>
+                <w:szCs w:val="17"/>
+              </w:rPr>
+              <w:t xml:space="preserve">Needs one-time mirrored-networking + auto-confirm setup</w:t>
+            </w:r>
+          </w:p>
+          <w:p>
+            <w:pPr>
+              <w:pStyle w:val="ListParagraph"/>
+              <w:numPr>
+                <w:ilvl w:val="0"/>
+                <w:numId w:val="1"/>
+              </w:numPr>
+              <w:spacing w:after="20"/>
+              <w:ind w:left="130" w:hanging="130"/>
+            </w:pPr>
+            <w:r>
+              <w:rPr>
+                <w:color w:val="000000"/>
+                <w:sz w:val="17"/>
+                <w:szCs w:val="17"/>
+              </w:rPr>
+              <w:t xml:space="preserve">No native GUI — command syntax to learn</w:t>
+            </w:r>
+          </w:p>
+        </w:tc>
+      </w:tr>
+      <w:tr>
+        <w:tc>
+          <w:tcPr>
+            <w:tcW w:type="dxa" w:w="1300"/>
+          </w:tcPr>
+          <w:p>
+            <w:pPr>
+              <w:spacing w:after="40"/>
+            </w:pPr>
+            <w:r>
+              <w:rPr>
+                <w:b/>
+                <w:bCs/>
+                <w:color w:val="000000"/>
+                <w:sz w:val="17"/>
+                <w:szCs w:val="17"/>
+              </w:rPr>
+              <w:t xml:space="preserve">SFTP Inbox / Vault</w:t>
+            </w:r>
+          </w:p>
+        </w:tc>
+        <w:tc>
+          <w:tcPr>
+            <w:tcW w:type="dxa" w:w="1950"/>
+          </w:tcPr>
+          <w:p>
+            <w:pPr>
+              <w:spacing w:after="40"/>
+            </w:pPr>
+            <w:r>
+              <w:rPr>
+                <w:b w:val="false"/>
+                <w:bCs w:val="false"/>
+                <w:color w:val="000000"/>
+                <w:sz w:val="17"/>
+                <w:szCs w:val="17"/>
+              </w:rPr>
+              <w:t xml:space="preserve">You create an expiring inbox access point in your Vault; an external collaborator uploads through a shared link or SFTP client into your encrypted Vault.</w:t>
+            </w:r>
+          </w:p>
+        </w:tc>
+        <w:tc>
+          <w:tcPr>
+            <w:tcW w:type="dxa" w:w="1950"/>
+          </w:tcPr>
+          <w:p>
+            <w:pPr>
+              <w:spacing w:after="40"/>
+            </w:pPr>
+            <w:r>
+              <w:rPr>
+                <w:b w:val="false"/>
+                <w:bCs w:val="false"/>
+                <w:color w:val="000000"/>
+                <w:sz w:val="17"/>
+                <w:szCs w:val="17"/>
+              </w:rPr>
+              <w:t xml:space="preserve">Receiving files from people who don't have tiCrypt accounts — external partners, collaborators, vendors.</w:t>
+            </w:r>
+          </w:p>
+        </w:tc>
+        <w:tc>
+          <w:tcPr>
+            <w:tcW w:type="dxa" w:w="1950"/>
+          </w:tcPr>
+          <w:p>
+            <w:pPr>
+              <w:pStyle w:val="ListParagraph"/>
+              <w:numPr>
+                <w:ilvl w:val="0"/>
+                <w:numId w:val="1"/>
+              </w:numPr>
+              <w:spacing w:after="20"/>
+              <w:ind w:left="130" w:hanging="130"/>
+            </w:pPr>
+            <w:r>
+              <w:rPr>
+                <w:color w:val="000000"/>
+                <w:sz w:val="17"/>
+                <w:szCs w:val="17"/>
+              </w:rPr>
+              <w:t xml:space="preserve">No tiCrypt account needed for the sender</w:t>
+            </w:r>
+          </w:p>
+          <w:p>
+            <w:pPr>
+              <w:pStyle w:val="ListParagraph"/>
+              <w:numPr>
+                <w:ilvl w:val="0"/>
+                <w:numId w:val="1"/>
+              </w:numPr>
+              <w:spacing w:after="20"/>
+              <w:ind w:left="130" w:hanging="130"/>
+            </w:pPr>
+            <w:r>
+              <w:rPr>
+                <w:color w:val="000000"/>
+                <w:sz w:val="17"/>
+                <w:szCs w:val="17"/>
+              </w:rPr>
+              <w:t xml:space="preserve">Expiration date limits exposure</w:t>
+            </w:r>
+          </w:p>
+          <w:p>
+            <w:pPr>
+              <w:pStyle w:val="ListParagraph"/>
+              <w:numPr>
+                <w:ilvl w:val="0"/>
+                <w:numId w:val="1"/>
+              </w:numPr>
+              <w:spacing w:after="20"/>
+              <w:ind w:left="130" w:hanging="130"/>
+            </w:pPr>
+            <w:r>
+              <w:rPr>
+                <w:color w:val="000000"/>
+                <w:sz w:val="17"/>
+                <w:szCs w:val="17"/>
+              </w:rPr>
+              <w:t xml:space="preserve">Files land encrypted in your Vault</w:t>
+            </w:r>
+          </w:p>
+        </w:tc>
+        <w:tc>
+          <w:tcPr>
+            <w:tcW w:type="dxa" w:w="1950"/>
+          </w:tcPr>
+          <w:p>
+            <w:pPr>
+              <w:pStyle w:val="ListParagraph"/>
+              <w:numPr>
+                <w:ilvl w:val="0"/>
+                <w:numId w:val="1"/>
+              </w:numPr>
+              <w:spacing w:after="20"/>
+              <w:ind w:left="130" w:hanging="130"/>
+            </w:pPr>
+            <w:r>
+              <w:rPr>
+                <w:color w:val="000000"/>
+                <w:sz w:val="17"/>
+                <w:szCs w:val="17"/>
+              </w:rPr>
+              <w:t xml:space="preserve">Extra step to move files from Vault into a VM</w:t>
+            </w:r>
+          </w:p>
+          <w:p>
+            <w:pPr>
+              <w:pStyle w:val="ListParagraph"/>
+              <w:numPr>
+                <w:ilvl w:val="0"/>
+                <w:numId w:val="1"/>
+              </w:numPr>
+              <w:spacing w:after="20"/>
+              <w:ind w:left="130" w:hanging="130"/>
+            </w:pPr>
+            <w:r>
+              <w:rPr>
+                <w:color w:val="000000"/>
+                <w:sz w:val="17"/>
+                <w:szCs w:val="17"/>
+              </w:rPr>
+              <w:t xml:space="preserve">Requires admin-configured SFTP server first</w:t>
+            </w:r>
+          </w:p>
+          <w:p>
+            <w:pPr>
+              <w:pStyle w:val="ListParagraph"/>
+              <w:numPr>
+                <w:ilvl w:val="0"/>
+                <w:numId w:val="1"/>
+              </w:numPr>
+              <w:spacing w:after="20"/>
+              <w:ind w:left="130" w:hanging="130"/>
+            </w:pPr>
+            <w:r>
+              <w:rPr>
+                <w:color w:val="000000"/>
+                <w:sz w:val="17"/>
+                <w:szCs w:val="17"/>
+              </w:rPr>
+              <w:t xml:space="preserve">Slight delay before uploads appear</w:t>
+            </w:r>
+          </w:p>
+        </w:tc>
+      </w:tr>
+    </w:tbl>
+    <w:p>
+      <w:pPr>
+        <w:spacing w:after="60"/>
+      </w:pPr>
     </w:p>
     <w:p>
       <w:pPr>

</xml_diff>